<commit_message>
Update frontend description and wireframes to V1
Replace Frontend Description.docx and 1-4.png with V1, which drops the
edit mode in line with the implementation plan.

Co-Authored-By: Claude Opus 5.5 <noreply@anthropic.com>
</commit_message>
<xml_diff>
--- a/docs/Frontend Description.docx
+++ b/docs/Frontend Description.docx
@@ -14,6 +14,7 @@
         <w:t>Front-end</w:t>
       </w:r>
     </w:p>
+    <w:p/>
     <w:p>
       <w:pPr>
         <w:pStyle w:val="a4"/>
@@ -167,7 +168,7 @@
         <w:rPr>
           <w:lang w:val="el-GR"/>
         </w:rPr>
-        <w:t>, και πάνω από αυτό θα υπάρχει σχετικό μήνυμα (</w:t>
+        <w:t xml:space="preserve"> και πάνω από αυτό θα υπάρχει σχετικό μήνυμα (</w:t>
       </w:r>
       <w:r>
         <w:t>Add</w:t>
@@ -751,19 +752,7 @@
         <w:rPr>
           <w:lang w:val="el-GR"/>
         </w:rPr>
-        <w:t xml:space="preserve">, αλλιώς πηγαίνει </w:t>
-      </w:r>
-      <w:r>
-        <w:rPr>
-          <w:lang w:val="el-GR"/>
-        </w:rPr>
-        <w:t>και</w:t>
-      </w:r>
-      <w:r>
-        <w:rPr>
-          <w:lang w:val="el-GR"/>
-        </w:rPr>
-        <w:t xml:space="preserve"> κάνει τις κατάλληλες αλλαγές.</w:t>
+        <w:t>.</w:t>
       </w:r>
       <w:r>
         <w:rPr>
@@ -838,71 +827,7 @@
         <w:rPr>
           <w:lang w:val="el-GR"/>
         </w:rPr>
-        <w:t xml:space="preserve">Τα αρχεία αυτά επιτρέπουν επίσης και την επεξεργασία τους για αλλαγές από τον χρήστη. </w:t>
-      </w:r>
-      <w:r>
-        <w:rPr>
-          <w:lang w:val="el-GR"/>
-        </w:rPr>
-        <w:t xml:space="preserve">Επομένως, εκτός από το Χ που υπάρχει στις προεπισκοπήσεις, </w:t>
-      </w:r>
-      <w:r>
-        <w:rPr>
-          <w:lang w:val="el-GR"/>
-        </w:rPr>
         <w:lastRenderedPageBreak/>
-        <w:t xml:space="preserve">θα υπάρχει και ένα σήμα επεξεργασίας (ένα </w:t>
-      </w:r>
-      <w:proofErr w:type="spellStart"/>
-      <w:r>
-        <w:rPr>
-          <w:lang w:val="el-GR"/>
-        </w:rPr>
-        <w:t>μολυβάκι</w:t>
-      </w:r>
-      <w:proofErr w:type="spellEnd"/>
-      <w:r>
-        <w:rPr>
-          <w:lang w:val="el-GR"/>
-        </w:rPr>
-        <w:t>)</w:t>
-      </w:r>
-      <w:r>
-        <w:rPr>
-          <w:lang w:val="el-GR"/>
-        </w:rPr>
-        <w:t xml:space="preserve"> στην πάνω αριστερή γωνία. Κατά την επεξεργασία του αρχείου, αυτό θα είναι </w:t>
-      </w:r>
-      <w:proofErr w:type="spellStart"/>
-      <w:r>
-        <w:rPr>
-          <w:lang w:val="el-GR"/>
-        </w:rPr>
-        <w:t>μεγενθυμένο</w:t>
-      </w:r>
-      <w:proofErr w:type="spellEnd"/>
-      <w:r>
-        <w:rPr>
-          <w:lang w:val="el-GR"/>
-        </w:rPr>
-        <w:t>.</w:t>
-      </w:r>
-    </w:p>
-    <w:p>
-      <w:pPr>
-        <w:pStyle w:val="a6"/>
-        <w:numPr>
-          <w:ilvl w:val="1"/>
-          <w:numId w:val="1"/>
-        </w:numPr>
-        <w:rPr>
-          <w:lang w:val="el-GR"/>
-        </w:rPr>
-      </w:pPr>
-      <w:r>
-        <w:rPr>
-          <w:lang w:val="el-GR"/>
-        </w:rPr>
         <w:t>Στην συνέχεια</w:t>
       </w:r>
       <w:r>
@@ -1487,7 +1412,6 @@
         </w:rPr>
         <w:t xml:space="preserve"> </w:t>
       </w:r>
-      <w:proofErr w:type="gramStart"/>
       <w:r>
         <w:rPr>
           <w:lang w:val="el-GR"/>
@@ -1504,14 +1428,7 @@
         <w:rPr>
           <w:lang w:val="el-GR"/>
         </w:rPr>
-        <w:t>τι</w:t>
-      </w:r>
-      <w:proofErr w:type="gramEnd"/>
-      <w:r>
-        <w:rPr>
-          <w:lang w:val="el-GR"/>
-        </w:rPr>
-        <w:t xml:space="preserve"> έχει να κάνει με την αισθητική της ιστοσελίδας (χρώμα, γραμματοσειρές </w:t>
+        <w:t xml:space="preserve">τι έχει να κάνει με την αισθητική της ιστοσελίδας (χρώμα, γραμματοσειρές </w:t>
       </w:r>
       <w:proofErr w:type="spellStart"/>
       <w:r>
@@ -2845,7 +2762,6 @@
         </w:rPr>
         <w:t xml:space="preserve">μέσω </w:t>
       </w:r>
-      <w:proofErr w:type="gramStart"/>
       <w:r>
         <w:rPr>
           <w:highlight w:val="yellow"/>
@@ -2857,15 +2773,7 @@
           <w:highlight w:val="yellow"/>
           <w:lang w:val="el-GR"/>
         </w:rPr>
-        <w:t>(</w:t>
-      </w:r>
-      <w:proofErr w:type="gramEnd"/>
-      <w:r>
-        <w:rPr>
-          <w:highlight w:val="yellow"/>
-          <w:lang w:val="el-GR"/>
-        </w:rPr>
-        <w:t>)</w:t>
+        <w:t>()</w:t>
       </w:r>
       <w:r>
         <w:rPr>
@@ -3433,7 +3341,6 @@
         </w:rPr>
         <w:t xml:space="preserve"> /</w:t>
       </w:r>
-      <w:proofErr w:type="gramStart"/>
       <w:r>
         <w:rPr>
           <w:highlight w:val="yellow"/>
@@ -3466,14 +3373,7 @@
         <w:rPr>
           <w:lang w:val="el-GR"/>
         </w:rPr>
-        <w:t>)</w:t>
-      </w:r>
-      <w:proofErr w:type="gramEnd"/>
-      <w:r>
-        <w:rPr>
-          <w:lang w:val="el-GR"/>
-        </w:rPr>
-        <w:t xml:space="preserve">, </w:t>
+        <w:t xml:space="preserve">), </w:t>
       </w:r>
       <w:r>
         <w:rPr>
@@ -5486,7 +5386,6 @@
         </w:rPr>
         <w:t xml:space="preserve"> </w:t>
       </w:r>
-      <w:proofErr w:type="gramStart"/>
       <w:r>
         <w:rPr>
           <w:lang w:val="el-GR"/>
@@ -5506,7 +5405,6 @@
         </w:rPr>
         <w:t>map</w:t>
       </w:r>
-      <w:proofErr w:type="gramEnd"/>
       <w:r>
         <w:rPr>
           <w:highlight w:val="yellow"/>
@@ -6546,7 +6444,6 @@
         <w:t xml:space="preserve">: </w:t>
       </w:r>
       <w:proofErr w:type="spellStart"/>
-      <w:proofErr w:type="gramStart"/>
       <w:r>
         <w:rPr>
           <w:highlight w:val="yellow"/>
@@ -6558,26 +6455,11 @@
         <w:rPr>
           <w:highlight w:val="yellow"/>
         </w:rPr>
-        <w:t>(</w:t>
-      </w:r>
-      <w:proofErr w:type="gramEnd"/>
-      <w:r>
-        <w:rPr>
-          <w:highlight w:val="yellow"/>
-        </w:rPr>
-        <w:t>0,0,0,0.5</w:t>
-      </w:r>
-      <w:proofErr w:type="gramStart"/>
-      <w:r>
-        <w:rPr>
-          <w:highlight w:val="yellow"/>
-        </w:rPr>
-        <w:t>);</w:t>
+        <w:t>(0,0,0,0.5);</w:t>
       </w:r>
       <w:r>
         <w:t>.</w:t>
       </w:r>
-      <w:proofErr w:type="gramEnd"/>
     </w:p>
     <w:p>
       <w:pPr>
@@ -7079,8 +6961,16 @@
         <w:rPr>
           <w:b/>
           <w:bCs/>
-        </w:rPr>
-        <w:t>Edit feature</w:t>
+          <w:lang w:val="el-GR"/>
+        </w:rPr>
+        <w:t xml:space="preserve">Το τελικό </w:t>
+      </w:r>
+      <w:r>
+        <w:rPr>
+          <w:b/>
+          <w:bCs/>
+        </w:rPr>
+        <w:t>confirm</w:t>
       </w:r>
     </w:p>
     <w:p>
@@ -7090,81 +6980,32 @@
           <w:ilvl w:val="1"/>
           <w:numId w:val="2"/>
         </w:numPr>
-        <w:rPr>
-          <w:lang w:val="el-GR"/>
-        </w:rPr>
-      </w:pPr>
-      <w:r>
-        <w:rPr>
-          <w:lang w:val="el-GR"/>
-        </w:rPr>
-        <w:lastRenderedPageBreak/>
-        <w:t xml:space="preserve">Κάθε </w:t>
-      </w:r>
-      <w:r>
-        <w:t>preview</w:t>
-      </w:r>
-      <w:r>
-        <w:rPr>
-          <w:lang w:val="el-GR"/>
-        </w:rPr>
-        <w:t xml:space="preserve"> </w:t>
-      </w:r>
-      <w:r>
-        <w:rPr>
-          <w:lang w:val="el-GR"/>
-        </w:rPr>
-        <w:t xml:space="preserve">έχει επιπλέον εικονίδιο </w:t>
-      </w:r>
-      <w:r>
-        <w:rPr>
-          <w:lang w:val="el-GR"/>
-        </w:rPr>
-        <w:t>(</w:t>
+      </w:pPr>
+      <w:r>
+        <w:t xml:space="preserve">Confirm </w:t>
+      </w:r>
+      <w:r>
+        <w:t>→</w:t>
+      </w:r>
+      <w:r>
+        <w:t xml:space="preserve"> </w:t>
       </w:r>
       <w:proofErr w:type="spellStart"/>
       <w:r>
         <w:rPr>
-          <w:lang w:val="el-GR"/>
-        </w:rPr>
-        <w:t>μολυβάκι</w:t>
+          <w:highlight w:val="yellow"/>
+        </w:rPr>
+        <w:t>useRouter</w:t>
       </w:r>
       <w:proofErr w:type="spellEnd"/>
       <w:r>
         <w:rPr>
-          <w:lang w:val="el-GR"/>
-        </w:rPr>
-        <w:t>)</w:t>
-      </w:r>
-      <w:r>
-        <w:rPr>
-          <w:lang w:val="el-GR"/>
-        </w:rPr>
-        <w:t xml:space="preserve"> πάνω αριστερά. Στο πάτημά του, ανοίγει πλήρης οθόνη </w:t>
-      </w:r>
-      <w:r>
-        <w:t>edit</w:t>
-      </w:r>
-      <w:r>
-        <w:rPr>
-          <w:lang w:val="el-GR"/>
-        </w:rPr>
-        <w:t xml:space="preserve"> </w:t>
-      </w:r>
-      <w:r>
-        <w:t>mode</w:t>
-      </w:r>
-      <w:r>
-        <w:rPr>
-          <w:lang w:val="el-GR"/>
-        </w:rPr>
-        <w:t xml:space="preserve"> </w:t>
-      </w:r>
-      <w:r>
-        <w:rPr>
-          <w:lang w:val="el-GR"/>
-        </w:rPr>
-        <w:t>για το συγκεκριμένο αρχείο.</w:t>
+          <w:highlight w:val="yellow"/>
+        </w:rPr>
+        <w:t>().push(‘/result’)</w:t>
+      </w:r>
+      <w:r>
+        <w:t>.</w:t>
       </w:r>
     </w:p>
     <w:p>
@@ -7183,252 +7024,86 @@
           <w:u w:val="single"/>
           <w:lang w:val="el-GR"/>
         </w:rPr>
-        <w:t>Ανοιχτό ζήτημα:</w:t>
-      </w:r>
-      <w:r>
-        <w:rPr>
-          <w:lang w:val="el-GR"/>
-        </w:rPr>
-        <w:t xml:space="preserve"> </w:t>
-      </w:r>
-    </w:p>
-    <w:p>
-      <w:pPr>
-        <w:pStyle w:val="a6"/>
-        <w:numPr>
-          <w:ilvl w:val="2"/>
-          <w:numId w:val="2"/>
-        </w:numPr>
-        <w:rPr>
-          <w:lang w:val="el-GR"/>
-        </w:rPr>
-      </w:pPr>
-      <w:r>
-        <w:rPr>
-          <w:lang w:val="el-GR"/>
-        </w:rPr>
-        <w:t xml:space="preserve">Για </w:t>
-      </w:r>
-      <w:r>
-        <w:t>Excel</w:t>
-      </w:r>
-      <w:r>
-        <w:rPr>
-          <w:lang w:val="el-GR"/>
-        </w:rPr>
-        <w:t xml:space="preserve">: </w:t>
-      </w:r>
-      <w:r>
-        <w:rPr>
-          <w:lang w:val="el-GR"/>
-        </w:rPr>
-        <w:t xml:space="preserve">επεξεργάσιμο </w:t>
-      </w:r>
-      <w:r>
-        <w:t>grid</w:t>
-      </w:r>
-      <w:r>
-        <w:rPr>
-          <w:lang w:val="el-GR"/>
-        </w:rPr>
-        <w:t xml:space="preserve"> </w:t>
-      </w:r>
-      <w:r>
-        <w:rPr>
-          <w:lang w:val="el-GR"/>
-        </w:rPr>
-        <w:t xml:space="preserve">μέσω </w:t>
+        <w:lastRenderedPageBreak/>
+        <w:t>Μεταφορά δεδομένων μεταξύ σελίδων:</w:t>
+      </w:r>
+      <w:r>
+        <w:rPr>
+          <w:lang w:val="el-GR"/>
+        </w:rPr>
+        <w:t xml:space="preserve"> </w:t>
+      </w:r>
+      <w:r>
+        <w:rPr>
+          <w:highlight w:val="yellow"/>
+        </w:rPr>
+        <w:t>query</w:t>
+      </w:r>
+      <w:r>
+        <w:rPr>
+          <w:highlight w:val="yellow"/>
+          <w:lang w:val="el-GR"/>
+        </w:rPr>
+        <w:t xml:space="preserve"> </w:t>
+      </w:r>
+      <w:r>
+        <w:rPr>
+          <w:highlight w:val="yellow"/>
+        </w:rPr>
+        <w:t>param</w:t>
+      </w:r>
+      <w:r>
+        <w:rPr>
+          <w:highlight w:val="yellow"/>
+          <w:lang w:val="el-GR"/>
+        </w:rPr>
+        <w:t xml:space="preserve"> (?</w:t>
       </w:r>
       <w:proofErr w:type="spellStart"/>
       <w:r>
         <w:rPr>
           <w:highlight w:val="yellow"/>
         </w:rPr>
-        <w:t>handsontable</w:t>
+        <w:t>fileId</w:t>
       </w:r>
       <w:proofErr w:type="spellEnd"/>
       <w:r>
         <w:rPr>
-          <w:lang w:val="el-GR"/>
-        </w:rPr>
-        <w:t xml:space="preserve"> </w:t>
-      </w:r>
-      <w:r>
-        <w:rPr>
-          <w:lang w:val="el-GR"/>
-        </w:rPr>
-        <w:t xml:space="preserve">(υποστηρίζει </w:t>
-      </w:r>
-      <w:r>
-        <w:t>inline</w:t>
-      </w:r>
-      <w:r>
-        <w:rPr>
-          <w:lang w:val="el-GR"/>
-        </w:rPr>
-        <w:t xml:space="preserve"> </w:t>
-      </w:r>
-      <w:r>
-        <w:t>editing</w:t>
-      </w:r>
-      <w:r>
-        <w:rPr>
-          <w:lang w:val="el-GR"/>
-        </w:rPr>
-        <w:t xml:space="preserve"> </w:t>
-      </w:r>
-      <w:r>
-        <w:rPr>
-          <w:lang w:val="el-GR"/>
-        </w:rPr>
-        <w:t xml:space="preserve">εγγενώς) ή </w:t>
-      </w:r>
-      <w:proofErr w:type="spellStart"/>
-      <w:r>
-        <w:rPr>
-          <w:highlight w:val="yellow"/>
-        </w:rPr>
-        <w:t>luckysheet</w:t>
-      </w:r>
-      <w:proofErr w:type="spellEnd"/>
-      <w:r>
-        <w:rPr>
-          <w:lang w:val="el-GR"/>
-        </w:rPr>
-        <w:t xml:space="preserve"> </w:t>
-      </w:r>
-      <w:r>
-        <w:rPr>
-          <w:lang w:val="el-GR"/>
-        </w:rPr>
-        <w:t xml:space="preserve">(πιο πλήρες, πιο </w:t>
-      </w:r>
-      <w:r>
-        <w:rPr>
-          <w:lang w:val="el-GR"/>
-        </w:rPr>
-        <w:t>βαρύ</w:t>
-      </w:r>
-      <w:r>
-        <w:rPr>
-          <w:lang w:val="el-GR"/>
-        </w:rPr>
-        <w:t xml:space="preserve"> σε μέγεθος).</w:t>
-      </w:r>
-    </w:p>
-    <w:p>
-      <w:pPr>
-        <w:pStyle w:val="a6"/>
-        <w:numPr>
-          <w:ilvl w:val="2"/>
-          <w:numId w:val="2"/>
-        </w:numPr>
-        <w:rPr>
-          <w:lang w:val="el-GR"/>
-        </w:rPr>
-      </w:pPr>
-      <w:r>
-        <w:rPr>
-          <w:lang w:val="el-GR"/>
-        </w:rPr>
-        <w:t>Για</w:t>
-      </w:r>
-      <w:r>
-        <w:rPr>
-          <w:lang w:val="el-GR"/>
-        </w:rPr>
-        <w:t xml:space="preserve"> </w:t>
-      </w:r>
-      <w:r>
-        <w:t>Word</w:t>
-      </w:r>
-      <w:r>
-        <w:rPr>
-          <w:lang w:val="el-GR"/>
-        </w:rPr>
-        <w:t xml:space="preserve">: </w:t>
-      </w:r>
-      <w:r>
-        <w:rPr>
-          <w:highlight w:val="yellow"/>
-        </w:rPr>
-        <w:t>rich</w:t>
-      </w:r>
-      <w:r>
-        <w:rPr>
-          <w:highlight w:val="yellow"/>
-          <w:lang w:val="el-GR"/>
-        </w:rPr>
-        <w:t xml:space="preserve"> </w:t>
-      </w:r>
-      <w:r>
-        <w:rPr>
-          <w:highlight w:val="yellow"/>
-        </w:rPr>
-        <w:t>text</w:t>
-      </w:r>
-      <w:r>
-        <w:rPr>
-          <w:highlight w:val="yellow"/>
-          <w:lang w:val="el-GR"/>
-        </w:rPr>
-        <w:t xml:space="preserve"> </w:t>
-      </w:r>
-      <w:r>
-        <w:rPr>
-          <w:highlight w:val="yellow"/>
-        </w:rPr>
-        <w:t>editor</w:t>
-      </w:r>
-      <w:r>
-        <w:rPr>
-          <w:lang w:val="el-GR"/>
-        </w:rPr>
-        <w:t xml:space="preserve"> </w:t>
-      </w:r>
-      <w:r>
-        <w:rPr>
-          <w:lang w:val="el-GR"/>
-        </w:rPr>
-        <w:t>όπως</w:t>
-      </w:r>
-      <w:r>
-        <w:rPr>
-          <w:lang w:val="el-GR"/>
-        </w:rPr>
-        <w:t xml:space="preserve"> </w:t>
-      </w:r>
-      <w:proofErr w:type="spellStart"/>
-      <w:r>
-        <w:rPr>
-          <w:highlight w:val="yellow"/>
-        </w:rPr>
-        <w:t>TinyMCE</w:t>
-      </w:r>
-      <w:proofErr w:type="spellEnd"/>
-      <w:r>
-        <w:rPr>
-          <w:lang w:val="el-GR"/>
-        </w:rPr>
-        <w:t xml:space="preserve"> </w:t>
-      </w:r>
-      <w:r>
-        <w:rPr>
-          <w:lang w:val="el-GR"/>
-        </w:rPr>
-        <w:t>ή</w:t>
-      </w:r>
-      <w:r>
-        <w:rPr>
-          <w:lang w:val="el-GR"/>
-        </w:rPr>
-        <w:t xml:space="preserve"> </w:t>
-      </w:r>
-      <w:r>
-        <w:rPr>
-          <w:highlight w:val="yellow"/>
-        </w:rPr>
-        <w:t>Slate</w:t>
+          <w:highlight w:val="yellow"/>
+          <w:lang w:val="el-GR"/>
+        </w:rPr>
+        <w:t>=…)</w:t>
+      </w:r>
+      <w:r>
+        <w:rPr>
+          <w:lang w:val="el-GR"/>
+        </w:rPr>
+        <w:t xml:space="preserve"> </w:t>
+      </w:r>
+      <w:r>
+        <w:rPr>
+          <w:lang w:val="el-GR"/>
+        </w:rPr>
+        <w:t xml:space="preserve">ή </w:t>
+      </w:r>
+      <w:r>
+        <w:rPr>
+          <w:highlight w:val="yellow"/>
+        </w:rPr>
+        <w:t>React</w:t>
+      </w:r>
+      <w:r>
+        <w:rPr>
+          <w:highlight w:val="yellow"/>
+          <w:lang w:val="el-GR"/>
+        </w:rPr>
+        <w:t xml:space="preserve"> </w:t>
+      </w:r>
+      <w:r>
+        <w:rPr>
+          <w:highlight w:val="yellow"/>
+        </w:rPr>
+        <w:t>Context</w:t>
       </w:r>
       <w:r>
         <w:rPr>
@@ -7440,221 +7115,28 @@
         <w:rPr>
           <w:lang w:val="el-GR"/>
         </w:rPr>
-        <w:t>φορτωμένος</w:t>
-      </w:r>
-      <w:r>
-        <w:rPr>
-          <w:lang w:val="el-GR"/>
-        </w:rPr>
-        <w:t xml:space="preserve"> </w:t>
-      </w:r>
-      <w:r>
-        <w:rPr>
-          <w:lang w:val="el-GR"/>
-        </w:rPr>
-        <w:t>με</w:t>
-      </w:r>
-      <w:r>
-        <w:rPr>
-          <w:lang w:val="el-GR"/>
-        </w:rPr>
-        <w:t xml:space="preserve"> </w:t>
-      </w:r>
-      <w:r>
-        <w:rPr>
-          <w:lang w:val="el-GR"/>
-        </w:rPr>
-        <w:t xml:space="preserve">το ήδη </w:t>
-      </w:r>
-      <w:r>
-        <w:rPr>
-          <w:lang w:val="el-GR"/>
-        </w:rPr>
-        <w:t>μετετρεμμένο</w:t>
-      </w:r>
-      <w:r>
-        <w:rPr>
-          <w:lang w:val="el-GR"/>
-        </w:rPr>
-        <w:t xml:space="preserve"> </w:t>
-      </w:r>
-      <w:r>
-        <w:t>HTML</w:t>
-      </w:r>
-      <w:r>
-        <w:rPr>
-          <w:lang w:val="el-GR"/>
-        </w:rPr>
-        <w:t xml:space="preserve"> </w:t>
-      </w:r>
-      <w:r>
-        <w:rPr>
-          <w:lang w:val="el-GR"/>
-        </w:rPr>
-        <w:t>περιεχόμενο.</w:t>
-      </w:r>
-    </w:p>
-    <w:p>
-      <w:pPr>
-        <w:pStyle w:val="a6"/>
-        <w:numPr>
-          <w:ilvl w:val="2"/>
-          <w:numId w:val="2"/>
-        </w:numPr>
-        <w:rPr>
-          <w:lang w:val="el-GR"/>
-        </w:rPr>
-      </w:pPr>
-      <w:r>
-        <w:rPr>
-          <w:lang w:val="el-GR"/>
-        </w:rPr>
-        <w:t xml:space="preserve">Οι αλλαγές πρέπει να αποθηκεύονται πίσω στο </w:t>
-      </w:r>
-      <w:r>
-        <w:t>backend</w:t>
-      </w:r>
-      <w:r>
-        <w:rPr>
-          <w:lang w:val="el-GR"/>
-        </w:rPr>
-        <w:t xml:space="preserve"> (</w:t>
-      </w:r>
-      <w:r>
-        <w:rPr>
-          <w:lang w:val="el-GR"/>
-        </w:rPr>
-        <w:t xml:space="preserve">Νέο </w:t>
-      </w:r>
-      <w:r>
-        <w:rPr>
-          <w:highlight w:val="yellow"/>
-        </w:rPr>
-        <w:t>PUT</w:t>
-      </w:r>
-      <w:r>
-        <w:rPr>
-          <w:highlight w:val="yellow"/>
+        <w:t xml:space="preserve">ώστε η σελίδα </w:t>
+      </w:r>
+      <w:r>
+        <w:rPr>
           <w:lang w:val="el-GR"/>
         </w:rPr>
         <w:t>/</w:t>
       </w:r>
       <w:r>
-        <w:rPr>
-          <w:highlight w:val="yellow"/>
-        </w:rPr>
-        <w:t>PATCH</w:t>
-      </w:r>
-      <w:r>
-        <w:rPr>
-          <w:highlight w:val="yellow"/>
-          <w:lang w:val="el-GR"/>
-        </w:rPr>
-        <w:t xml:space="preserve"> </w:t>
-      </w:r>
-      <w:r>
-        <w:rPr>
-          <w:highlight w:val="yellow"/>
-        </w:rPr>
-        <w:t>request</w:t>
-      </w:r>
-      <w:r>
-        <w:rPr>
-          <w:lang w:val="el-GR"/>
-        </w:rPr>
-        <w:t xml:space="preserve">) </w:t>
-      </w:r>
-      <w:r>
-        <w:rPr>
-          <w:lang w:val="el-GR"/>
-        </w:rPr>
-        <w:t xml:space="preserve">πριν το </w:t>
-      </w:r>
-      <w:r>
-        <w:t>Confirm</w:t>
-      </w:r>
-      <w:r>
-        <w:rPr>
-          <w:lang w:val="el-GR"/>
-        </w:rPr>
-        <w:t xml:space="preserve">, </w:t>
-      </w:r>
-      <w:r>
-        <w:rPr>
-          <w:lang w:val="el-GR"/>
-        </w:rPr>
-        <w:t xml:space="preserve">ή να κρατιούνται προσωρινά σε </w:t>
-      </w:r>
-      <w:r>
-        <w:t>local</w:t>
-      </w:r>
-      <w:r>
-        <w:rPr>
-          <w:lang w:val="el-GR"/>
-        </w:rPr>
-        <w:t xml:space="preserve"> </w:t>
-      </w:r>
-      <w:proofErr w:type="spellStart"/>
-      <w:r>
-        <w:rPr>
-          <w:highlight w:val="yellow"/>
-        </w:rPr>
-        <w:t>useS</w:t>
-      </w:r>
-      <w:r>
-        <w:rPr>
-          <w:highlight w:val="yellow"/>
-        </w:rPr>
-        <w:t>tate</w:t>
-      </w:r>
-      <w:proofErr w:type="spellEnd"/>
-      <w:r>
-        <w:rPr>
-          <w:lang w:val="el-GR"/>
-        </w:rPr>
-        <w:t xml:space="preserve"> </w:t>
-      </w:r>
-      <w:r>
-        <w:rPr>
-          <w:lang w:val="el-GR"/>
-        </w:rPr>
-        <w:t xml:space="preserve">και να στέλνονται όλες μαζί στο </w:t>
-      </w:r>
-      <w:r>
-        <w:t>Confirm</w:t>
-      </w:r>
-      <w:r>
-        <w:rPr>
-          <w:lang w:val="el-GR"/>
-        </w:rPr>
-        <w:t xml:space="preserve"> </w:t>
-      </w:r>
-    </w:p>
-    <w:p>
-      <w:pPr>
-        <w:pStyle w:val="a6"/>
-        <w:numPr>
-          <w:ilvl w:val="0"/>
-          <w:numId w:val="2"/>
-        </w:numPr>
-        <w:rPr>
-          <w:lang w:val="el-GR"/>
-        </w:rPr>
-      </w:pPr>
-      <w:r>
-        <w:rPr>
-          <w:b/>
-          <w:bCs/>
-          <w:lang w:val="el-GR"/>
-        </w:rPr>
-        <w:t xml:space="preserve">Το τελικό </w:t>
-      </w:r>
-      <w:r>
-        <w:rPr>
-          <w:b/>
-          <w:bCs/>
-        </w:rPr>
-        <w:t>confirm</w:t>
+        <w:t>result</w:t>
+      </w:r>
+      <w:r>
+        <w:rPr>
+          <w:lang w:val="el-GR"/>
+        </w:rPr>
+        <w:t xml:space="preserve"> </w:t>
+      </w:r>
+      <w:r>
+        <w:rPr>
+          <w:lang w:val="el-GR"/>
+        </w:rPr>
+        <w:t>να ξέρει ποια αρχεία να δείξει.</w:t>
       </w:r>
     </w:p>
     <w:p>
@@ -7666,185 +7148,6 @@
         </w:numPr>
       </w:pPr>
       <w:r>
-        <w:t xml:space="preserve">Confirm </w:t>
-      </w:r>
-      <w:r>
-        <w:t>→</w:t>
-      </w:r>
-      <w:r>
-        <w:t xml:space="preserve"> </w:t>
-      </w:r>
-      <w:proofErr w:type="spellStart"/>
-      <w:r>
-        <w:rPr>
-          <w:highlight w:val="yellow"/>
-        </w:rPr>
-        <w:t>useRouter</w:t>
-      </w:r>
-      <w:proofErr w:type="spellEnd"/>
-      <w:r>
-        <w:rPr>
-          <w:highlight w:val="yellow"/>
-        </w:rPr>
-        <w:t>(</w:t>
-      </w:r>
-      <w:proofErr w:type="gramStart"/>
-      <w:r>
-        <w:rPr>
-          <w:highlight w:val="yellow"/>
-        </w:rPr>
-        <w:t>).push</w:t>
-      </w:r>
-      <w:proofErr w:type="gramEnd"/>
-      <w:r>
-        <w:rPr>
-          <w:highlight w:val="yellow"/>
-        </w:rPr>
-        <w:t>(‘/result’)</w:t>
-      </w:r>
-      <w:r>
-        <w:t>.</w:t>
-      </w:r>
-    </w:p>
-    <w:p>
-      <w:pPr>
-        <w:pStyle w:val="a6"/>
-        <w:numPr>
-          <w:ilvl w:val="1"/>
-          <w:numId w:val="2"/>
-        </w:numPr>
-        <w:rPr>
-          <w:lang w:val="el-GR"/>
-        </w:rPr>
-      </w:pPr>
-      <w:r>
-        <w:rPr>
-          <w:u w:val="single"/>
-          <w:lang w:val="el-GR"/>
-        </w:rPr>
-        <w:t>Μεταφορά δεδομένων μεταξύ σελίδων:</w:t>
-      </w:r>
-      <w:r>
-        <w:rPr>
-          <w:lang w:val="el-GR"/>
-        </w:rPr>
-        <w:t xml:space="preserve"> </w:t>
-      </w:r>
-      <w:r>
-        <w:rPr>
-          <w:highlight w:val="yellow"/>
-        </w:rPr>
-        <w:t>query</w:t>
-      </w:r>
-      <w:r>
-        <w:rPr>
-          <w:highlight w:val="yellow"/>
-          <w:lang w:val="el-GR"/>
-        </w:rPr>
-        <w:t xml:space="preserve"> </w:t>
-      </w:r>
-      <w:r>
-        <w:rPr>
-          <w:highlight w:val="yellow"/>
-        </w:rPr>
-        <w:t>param</w:t>
-      </w:r>
-      <w:r>
-        <w:rPr>
-          <w:highlight w:val="yellow"/>
-          <w:lang w:val="el-GR"/>
-        </w:rPr>
-        <w:t xml:space="preserve"> (?</w:t>
-      </w:r>
-      <w:proofErr w:type="spellStart"/>
-      <w:r>
-        <w:rPr>
-          <w:highlight w:val="yellow"/>
-        </w:rPr>
-        <w:t>fileId</w:t>
-      </w:r>
-      <w:proofErr w:type="spellEnd"/>
-      <w:r>
-        <w:rPr>
-          <w:highlight w:val="yellow"/>
-          <w:lang w:val="el-GR"/>
-        </w:rPr>
-        <w:t>=…)</w:t>
-      </w:r>
-      <w:r>
-        <w:rPr>
-          <w:lang w:val="el-GR"/>
-        </w:rPr>
-        <w:t xml:space="preserve"> </w:t>
-      </w:r>
-      <w:r>
-        <w:rPr>
-          <w:lang w:val="el-GR"/>
-        </w:rPr>
-        <w:t xml:space="preserve">ή </w:t>
-      </w:r>
-      <w:r>
-        <w:rPr>
-          <w:highlight w:val="yellow"/>
-        </w:rPr>
-        <w:t>React</w:t>
-      </w:r>
-      <w:r>
-        <w:rPr>
-          <w:highlight w:val="yellow"/>
-          <w:lang w:val="el-GR"/>
-        </w:rPr>
-        <w:t xml:space="preserve"> </w:t>
-      </w:r>
-      <w:r>
-        <w:rPr>
-          <w:highlight w:val="yellow"/>
-        </w:rPr>
-        <w:t>Context</w:t>
-      </w:r>
-      <w:r>
-        <w:rPr>
-          <w:lang w:val="el-GR"/>
-        </w:rPr>
-        <w:t xml:space="preserve">, </w:t>
-      </w:r>
-      <w:r>
-        <w:rPr>
-          <w:lang w:val="el-GR"/>
-        </w:rPr>
-        <w:t xml:space="preserve">ώστε η σελίδα </w:t>
-      </w:r>
-      <w:r>
-        <w:rPr>
-          <w:lang w:val="el-GR"/>
-        </w:rPr>
-        <w:t>/</w:t>
-      </w:r>
-      <w:r>
-        <w:t>result</w:t>
-      </w:r>
-      <w:r>
-        <w:rPr>
-          <w:lang w:val="el-GR"/>
-        </w:rPr>
-        <w:t xml:space="preserve"> </w:t>
-      </w:r>
-      <w:r>
-        <w:rPr>
-          <w:lang w:val="el-GR"/>
-        </w:rPr>
-        <w:t>να ξέρει ποια αρχεία να δείξει.</w:t>
-      </w:r>
-    </w:p>
-    <w:p>
-      <w:pPr>
-        <w:pStyle w:val="a6"/>
-        <w:numPr>
-          <w:ilvl w:val="1"/>
-          <w:numId w:val="2"/>
-        </w:numPr>
-      </w:pPr>
-      <w:r>
         <w:rPr>
           <w:lang w:val="el-GR"/>
         </w:rPr>
@@ -8048,7 +7351,6 @@
         </w:rPr>
         <w:t xml:space="preserve"> </w:t>
       </w:r>
-      <w:proofErr w:type="gramStart"/>
       <w:r>
         <w:rPr>
           <w:i/>
@@ -8057,11 +7359,7 @@
         <w:t>download</w:t>
       </w:r>
       <w:r>
-        <w:t>.»</w:t>
-      </w:r>
-      <w:proofErr w:type="gramEnd"/>
-      <w:r>
-        <w:t>)</w:t>
+        <w:t>.»)</w:t>
       </w:r>
       <w:r>
         <w:t xml:space="preserve">, </w:t>
@@ -12712,6 +12010,7 @@
   <w:style w:type="character" w:default="1" w:styleId="a0">
     <w:name w:val="Default Paragraph Font"/>
     <w:uiPriority w:val="1"/>
+    <w:semiHidden/>
     <w:unhideWhenUsed/>
   </w:style>
   <w:style w:type="table" w:default="1" w:styleId="a1">

</xml_diff>

<commit_message>
Align status names in frontend description with the plan
Rename extracting_text/analyzing_data/generating_preview to
extracting/analyzing/generating and add the error status.

Co-Authored-By: Claude Opus 5.5 <noreply@anthropic.com>
</commit_message>
<xml_diff>
--- a/docs/Frontend Description.docx
+++ b/docs/Frontend Description.docx
@@ -4143,7 +4143,7 @@
       </w:r>
       <w:proofErr w:type="spellStart"/>
       <w:r>
-        <w:t>extracting_text</w:t>
+        <w:t>extracting</w:t>
       </w:r>
       <w:proofErr w:type="spellEnd"/>
       <w:r>
@@ -4151,7 +4151,7 @@
       </w:r>
       <w:proofErr w:type="spellStart"/>
       <w:r>
-        <w:t>analyzing_data</w:t>
+        <w:t>analyzing</w:t>
       </w:r>
       <w:proofErr w:type="spellEnd"/>
       <w:r>
@@ -4159,11 +4159,11 @@
       </w:r>
       <w:proofErr w:type="spellStart"/>
       <w:r>
-        <w:t>generating_preview</w:t>
+        <w:t>generating</w:t>
       </w:r>
       <w:proofErr w:type="spellEnd"/>
       <w:r>
-        <w:t xml:space="preserve">, done) </w:t>
+        <w:t xml:space="preserve">, done, error) </w:t>
       </w:r>
       <w:r>
         <w:rPr>

</xml_diff>